<commit_message>
Commit 2. Detección de objetos
se decidió migrar todas las herramientas utilizadas a una pc mas potente para usar un modelo de IA con la capacidad de detectar objetos mediante una camara
</commit_message>
<xml_diff>
--- a/Octava semana de Técnicas de Inteligencia Artificial.docx
+++ b/Octava semana de Técnicas de Inteligencia Artificial.docx
@@ -48,6 +48,35 @@
           <w:rtl w:val="0"/>
         </w:rPr>
         <w:t xml:space="preserve"> El día martes 13 de octubre no hubo clases por el huracán que nunca vino, pero bueno igual decidí hacer unas pruebas, ya que aun no he encontrado manera de estabilizar el dron, y he estado planteando la posibilidad de comprar uno, ya que creo que no se estabiliza debido a algun daño fisico que puede tener en la estructura del dron o las hélices. </w:t>
+      </w:r>
+    </w:p>
+    <w:p>
+      <w:pPr>
+        <w:rPr/>
+      </w:pPr>
+      <w:r>
+        <w:rPr>
+          <w:rtl w:val="0"/>
+        </w:rPr>
+      </w:r>
+    </w:p>
+    <w:p>
+      <w:pPr>
+        <w:rPr/>
+      </w:pPr>
+      <w:r>
+        <w:rPr>
+          <w:b w:val="1"/>
+          <w:bCs w:val="1"/>
+          <w:rtl w:val="0"/>
+        </w:rPr>
+        <w:t xml:space="preserve">Actividad 2</w:t>
+      </w:r>
+      <w:r>
+        <w:rPr>
+          <w:rtl w:val="0"/>
+        </w:rPr>
+        <w:t xml:space="preserve">: el día martes 13 de octubre, decidí migrar el proyecto en linux a otra pc debido a que lo más probable es que necesite hacer pruebas con algún modelo de IA que necesite alguna GPU dedicada.</w:t>
       </w:r>
     </w:p>
     <w:p>

</xml_diff>